<commit_message>
Resume: add site and is-a.dev email, Java, React, Linux, SSH; drop LaTeX, Excel and Achievements; sharpen project descriptions
</commit_message>
<xml_diff>
--- a/resume/Piyush-Chaudhary-Resume.docx
+++ b/resume/Piyush-Chaudhary-Resume.docx
@@ -19,7 +19,7 @@
         <w:jc w:val="center"/>
       </w:pPr>
       <w:r>
-        <w:t>piyush.chaudhary@somaiya.edu | github.com/Piyushchy | linkedin.com/in/piyush-chaudhary-9b5999187 | piyushchy.github.io</w:t>
+        <w:t>mail@piyushchy.is-a.dev | piyushchy.is-a.dev | github.com/Piyushchy | linkedin.com/in/piyush-chaudhary-9b5999187</w:t>
       </w:r>
     </w:p>
     <w:p>
@@ -144,7 +144,7 @@
         <w:pStyle w:val="ListBullet"/>
       </w:pPr>
       <w:r>
-        <w:t>Generated synthetic scanned PDFs with noise and skew for testing, and documented the system in a 16-page technical report written in LaTeX.</w:t>
+        <w:t>Generated synthetic scanned PDFs with noise and skew for testing, and documented the system in a 16-page technical report.</w:t>
       </w:r>
     </w:p>
     <w:p>
@@ -242,7 +242,7 @@
         <w:pStyle w:val="ListBullet"/>
       </w:pPr>
       <w:r>
-        <w:t>Shares a Windows PC's mouse and keyboard with an Android phone: a Python desktop app captures input and a Kotlin Android app receives and acts on it.</w:t>
+        <w:t>Built because I could not find an existing tool that shares a Windows PC's mouse and keyboard with an Android phone: a Python desktop app captures input and a Kotlin Android app receives and acts on it.</w:t>
       </w:r>
     </w:p>
     <w:p>
@@ -279,7 +279,7 @@
         <w:pStyle w:val="ListBullet"/>
       </w:pPr>
       <w:r>
-        <w:t>Browser tool that crops a GIF to a freehand or polygon shape and overlays one GIF on another with per-frame controls (blank, skip, hold, and shifting one track against the other).</w:t>
+        <w:t>Built because I could not find an existing tool that crops a GIF to a freehand or polygon shape or overlays one GIF on another with frame-level control.</w:t>
       </w:r>
     </w:p>
     <w:p>
@@ -287,7 +287,7 @@
         <w:pStyle w:val="ListBullet"/>
       </w:pPr>
       <w:r>
-        <w:t>Wrote the GIF decoder and encoder from scratch (LZW and median-cut palette). Runs entirely in the browser, so nothing is uploaded.</w:t>
+        <w:t>Overlay mode has two frame tracks to slide against each other, plus per-frame blank, skip and hold. Wrote the GIF decoder and encoder from scratch (LZW, median-cut palette). Runs entirely in the browser.</w:t>
       </w:r>
     </w:p>
     <w:p>
@@ -367,7 +367,18 @@
         <w:t xml:space="preserve">Languages: </w:t>
       </w:r>
       <w:r>
-        <w:t>Python, Kotlin, JavaScript, HTML, CSS, LaTeX</w:t>
+        <w:t>Python, Java, Kotlin, JavaScript, HTML, CSS</w:t>
+      </w:r>
+    </w:p>
+    <w:p>
+      <w:r>
+        <w:rPr>
+          <w:b/>
+        </w:rPr>
+        <w:t xml:space="preserve">Web: </w:t>
+      </w:r>
+      <w:r>
+        <w:t>React, HTML5, CSS3</w:t>
       </w:r>
     </w:p>
     <w:p>
@@ -408,29 +419,10 @@
         <w:rPr>
           <w:b/>
         </w:rPr>
-        <w:t xml:space="preserve">Tools: </w:t>
+        <w:t xml:space="preserve">Tools and systems: </w:t>
       </w:r>
       <w:r>
-        <w:t>Git, GitHub, Google Colab, openpyxl, Excel automation</w:t>
-      </w:r>
-    </w:p>
-    <w:p>
-      <w:pPr>
-        <w:pStyle w:val="Heading1"/>
-        <w:pBdr>
-          <w:bottom w:val="single" w:sz="6" w:space="1" w:color="000000"/>
-        </w:pBdr>
-      </w:pPr>
-      <w:r>
-        <w:t>ACHIEVEMENTS</w:t>
-      </w:r>
-    </w:p>
-    <w:p>
-      <w:pPr>
-        <w:pStyle w:val="ListBullet"/>
-      </w:pPr>
-      <w:r>
-        <w:t>1st runner up, hackathon, for The Tangled Path (team leader and front-end developer)</w:t>
+        <w:t>Linux (command line), SSH, Git, GitHub, Google Colab, openpyxl</w:t>
       </w:r>
     </w:p>
     <w:sectPr>

</xml_diff>

<commit_message>
Resume: restore college email alongside is-a.dev email; use standard ATS keywords
</commit_message>
<xml_diff>
--- a/resume/Piyush-Chaudhary-Resume.docx
+++ b/resume/Piyush-Chaudhary-Resume.docx
@@ -19,7 +19,7 @@
         <w:jc w:val="center"/>
       </w:pPr>
       <w:r>
-        <w:t>mail@piyushchy.is-a.dev | piyushchy.is-a.dev | github.com/Piyushchy | linkedin.com/in/piyush-chaudhary-9b5999187</w:t>
+        <w:t>piyush.chaudhary@somaiya.edu | mail@piyushchy.is-a.dev | piyushchy.is-a.dev | github.com/Piyushchy | linkedin.com/in/piyush-chaudhary-9b5999187</w:t>
       </w:r>
     </w:p>
     <w:p>
@@ -378,7 +378,7 @@
         <w:t xml:space="preserve">Web: </w:t>
       </w:r>
       <w:r>
-        <w:t>React, HTML5, CSS3</w:t>
+        <w:t>React.js, HTML5, CSS3</w:t>
       </w:r>
     </w:p>
     <w:p>
@@ -422,7 +422,7 @@
         <w:t xml:space="preserve">Tools and systems: </w:t>
       </w:r>
       <w:r>
-        <w:t>Linux (command line), SSH, Git, GitHub, Google Colab, openpyxl</w:t>
+        <w:t>Linux, Command Line (CLI), SSH, Git, GitHub, Google Colab, openpyxl</w:t>
       </w:r>
     </w:p>
     <w:sectPr>

</xml_diff>

<commit_message>
Three internships with real dates and departments (SBI 2026, Mazagon Dock 2025, SBI 2024) on site and resume
</commit_message>
<xml_diff>
--- a/resume/Piyush-Chaudhary-Resume.docx
+++ b/resume/Piyush-Chaudhary-Resume.docx
@@ -35,7 +35,7 @@
     </w:p>
     <w:p>
       <w:r>
-        <w:t>Final-year B.Tech Computer Engineering student who builds document-processing, cloud and mobile software. Currently an intern at SBI Global IT Centre, previously an intern at Mazagon Dock Shipbuilders Limited.</w:t>
+        <w:t>Final-year B.Tech Computer Engineering student building document-processing, cloud and mobile software. Three internships: State Bank of India (two) and Mazagon Dock Shipbuilders.</w:t>
       </w:r>
     </w:p>
     <w:p>
@@ -97,14 +97,14 @@
         <w:rPr>
           <w:b/>
         </w:rPr>
-        <w:t>Intern</w:t>
+        <w:t>Summer Intern</w:t>
       </w:r>
       <w:r>
-        <w:t>, State Bank of India, Global IT Centre</w:t>
+        <w:t>, State Bank of India, Analytics Department</w:t>
       </w:r>
       <w:r>
         <w:tab/>
-        <w:t>Present</w:t>
+        <w:t>May 2026 - Jul 2026</w:t>
       </w:r>
     </w:p>
     <w:p>
@@ -112,7 +112,7 @@
         <w:pStyle w:val="ListBullet"/>
       </w:pPr>
       <w:r>
-        <w:t>Building a production pipeline that extracts structured tables from scanned telecom audit PDFs into Excel, using a hybrid of computer vision (PyMuPDF, OpenCV) and a vision-language model.</w:t>
+        <w:t>Project: image to structured dataset conversion and predictive model building. Built a production pipeline that extracts structured tables from scanned telecom audit PDFs into Excel, using a hybrid of computer vision (PyMuPDF, OpenCV) and a vision-language model.</w:t>
       </w:r>
     </w:p>
     <w:p>
@@ -128,7 +128,7 @@
         <w:pStyle w:val="ListBullet"/>
       </w:pPr>
       <w:r>
-        <w:t>Added a fast pre-scan that locates key header fields and the conclusion-table page range before the per-page pass, and switched to lazy page generators after eager rendering exhausted memory.</w:t>
+        <w:t>Added a fast pre-scan for key header fields and the conclusion-table pages, and switched to lazy page generators after eager rendering exhausted memory.</w:t>
       </w:r>
     </w:p>
     <w:p>
@@ -158,10 +158,43 @@
         <w:rPr>
           <w:b/>
         </w:rPr>
-        <w:t>Intern</w:t>
+        <w:t>Industrial Training Intern</w:t>
       </w:r>
       <w:r>
-        <w:t>, Mazagon Dock Shipbuilders Limited</w:t>
+        <w:t>, Mazagon Dock Shipbuilders Limited, CIT Department</w:t>
+      </w:r>
+      <w:r>
+        <w:tab/>
+        <w:t>Jun 2025</w:t>
+      </w:r>
+    </w:p>
+    <w:p>
+      <w:pPr>
+        <w:tabs>
+          <w:tab w:pos="10368" w:val="right"/>
+        </w:tabs>
+        <w:spacing w:before="40"/>
+      </w:pPr>
+      <w:r>
+        <w:rPr>
+          <w:b/>
+        </w:rPr>
+        <w:t>Summer Intern</w:t>
+      </w:r>
+      <w:r>
+        <w:t>, State Bank of India, Business Intelligence Department</w:t>
+      </w:r>
+      <w:r>
+        <w:tab/>
+        <w:t>Jun 2024</w:t>
+      </w:r>
+    </w:p>
+    <w:p>
+      <w:pPr>
+        <w:pStyle w:val="ListBullet"/>
+      </w:pPr>
+      <w:r>
+        <w:t>Project: Dashboard Access Management Tool. Completed the project and submitted a project report.</w:t>
       </w:r>
     </w:p>
     <w:p>

</xml_diff>